<commit_message>
feat: add RAG experience section + fix PDF export for Linux
- Add insert_rag_experience_with_highlights() to render RAG bullet
  with highlighted key phrases, mirroring insert_bio_with_highlights
- Fix insert_skills_with_colored_headings() being called with
  mismatched args for [rag_experience] placeholder
- Replace docx2pdf (Word-only) with LibreOffice headless conversion
  for cross-platform PDF export
</commit_message>
<xml_diff>
--- a/supported_documents/Priyanshu_Harsana_Resume.docx
+++ b/supported_documents/Priyanshu_Harsana_Resume.docx
@@ -160,7 +160,25 @@
           <w:sz w:val="20"/>
           <w:szCs w:val="20"/>
         </w:rPr>
-        <w:t>[</w:t>
+        <w:t>[AI/ML Engineer</w:t>
+      </w:r>
+      <w:r>
+        <w:rPr>
+          <w:rFonts w:eastAsia="Calibri" w:cs="Calibri" w:ascii="Calibri" w:hAnsi="Calibri"/>
+          <w:color w:val="444444"/>
+          <w:sz w:val="20"/>
+          <w:szCs w:val="20"/>
+        </w:rPr>
+        <w:t xml:space="preserve"> with </w:t>
+      </w:r>
+      <w:r>
+        <w:rPr>
+          <w:rFonts w:eastAsia="Calibri" w:cs="Calibri" w:ascii="Calibri" w:hAnsi="Calibri"/>
+          <w:color w:val="444444"/>
+          <w:sz w:val="20"/>
+          <w:szCs w:val="20"/>
+        </w:rPr>
+        <w:t>3</w:t>
       </w:r>
       <w:r>
         <w:rPr>
@@ -170,16 +188,16 @@
           <w:sz w:val="20"/>
           <w:szCs w:val="20"/>
         </w:rPr>
-        <w:t>AI/ML Engineer</w:t>
-      </w:r>
-      <w:r>
-        <w:rPr>
-          <w:rFonts w:eastAsia="Calibri" w:cs="Calibri" w:ascii="Calibri" w:hAnsi="Calibri"/>
-          <w:color w:val="444444"/>
-          <w:sz w:val="20"/>
-          <w:szCs w:val="20"/>
-        </w:rPr>
-        <w:t xml:space="preserve"> with 2</w:t>
+        <w:t>+ years of experience</w:t>
+      </w:r>
+      <w:r>
+        <w:rPr>
+          <w:rFonts w:eastAsia="Calibri" w:cs="Calibri" w:ascii="Calibri" w:hAnsi="Calibri"/>
+          <w:color w:val="444444"/>
+          <w:sz w:val="20"/>
+          <w:szCs w:val="20"/>
+        </w:rPr>
+        <w:t xml:space="preserve"> building and deploying </w:t>
       </w:r>
       <w:r>
         <w:rPr>
@@ -189,16 +207,16 @@
           <w:sz w:val="20"/>
           <w:szCs w:val="20"/>
         </w:rPr>
-        <w:t>+ years of experience</w:t>
-      </w:r>
-      <w:r>
-        <w:rPr>
-          <w:rFonts w:eastAsia="Calibri" w:cs="Calibri" w:ascii="Calibri" w:hAnsi="Calibri"/>
-          <w:color w:val="444444"/>
-          <w:sz w:val="20"/>
-          <w:szCs w:val="20"/>
-        </w:rPr>
-        <w:t xml:space="preserve"> building and deploying </w:t>
+        <w:t>production-grade Machine Learning , Generative AI and Python-based solutions</w:t>
+      </w:r>
+      <w:r>
+        <w:rPr>
+          <w:rFonts w:eastAsia="Calibri" w:cs="Calibri" w:ascii="Calibri" w:hAnsi="Calibri"/>
+          <w:color w:val="444444"/>
+          <w:sz w:val="20"/>
+          <w:szCs w:val="20"/>
+        </w:rPr>
+        <w:t xml:space="preserve"> across the full ML lifecycle—from </w:t>
       </w:r>
       <w:r>
         <w:rPr>
@@ -208,16 +226,16 @@
           <w:sz w:val="20"/>
           <w:szCs w:val="20"/>
         </w:rPr>
-        <w:t>production-grade Machine Learning , Generative AI and Python-based solutions</w:t>
-      </w:r>
-      <w:r>
-        <w:rPr>
-          <w:rFonts w:eastAsia="Calibri" w:cs="Calibri" w:ascii="Calibri" w:hAnsi="Calibri"/>
-          <w:color w:val="444444"/>
-          <w:sz w:val="20"/>
-          <w:szCs w:val="20"/>
-        </w:rPr>
-        <w:t xml:space="preserve"> across the full ML lifecycle—from </w:t>
+        <w:t>ETL and feature engineering</w:t>
+      </w:r>
+      <w:r>
+        <w:rPr>
+          <w:rFonts w:eastAsia="Calibri" w:cs="Calibri" w:ascii="Calibri" w:hAnsi="Calibri"/>
+          <w:color w:val="444444"/>
+          <w:sz w:val="20"/>
+          <w:szCs w:val="20"/>
+        </w:rPr>
+        <w:t xml:space="preserve"> to </w:t>
       </w:r>
       <w:r>
         <w:rPr>
@@ -227,16 +245,16 @@
           <w:sz w:val="20"/>
           <w:szCs w:val="20"/>
         </w:rPr>
-        <w:t>ETL and feature engineering</w:t>
-      </w:r>
-      <w:r>
-        <w:rPr>
-          <w:rFonts w:eastAsia="Calibri" w:cs="Calibri" w:ascii="Calibri" w:hAnsi="Calibri"/>
-          <w:color w:val="444444"/>
-          <w:sz w:val="20"/>
-          <w:szCs w:val="20"/>
-        </w:rPr>
-        <w:t xml:space="preserve"> to </w:t>
+        <w:t>model training, LLM applications, multimodal RAG, MLOps, deployment, and monitoring</w:t>
+      </w:r>
+      <w:r>
+        <w:rPr>
+          <w:rFonts w:eastAsia="Calibri" w:cs="Calibri" w:ascii="Calibri" w:hAnsi="Calibri"/>
+          <w:color w:val="444444"/>
+          <w:sz w:val="20"/>
+          <w:szCs w:val="20"/>
+        </w:rPr>
+        <w:t xml:space="preserve">. Skilled in </w:t>
       </w:r>
       <w:r>
         <w:rPr>
@@ -246,16 +264,16 @@
           <w:sz w:val="20"/>
           <w:szCs w:val="20"/>
         </w:rPr>
-        <w:t>model training, LLM applications, multimodal RAG, MLOps, deployment, and monitoring</w:t>
-      </w:r>
-      <w:r>
-        <w:rPr>
-          <w:rFonts w:eastAsia="Calibri" w:cs="Calibri" w:ascii="Calibri" w:hAnsi="Calibri"/>
-          <w:color w:val="444444"/>
-          <w:sz w:val="20"/>
-          <w:szCs w:val="20"/>
-        </w:rPr>
-        <w:t xml:space="preserve">. Skilled in </w:t>
+        <w:t>Python, FastAPI, PostgreSQL (pgvector), LangChain, and cloud-ready AI systems</w:t>
+      </w:r>
+      <w:r>
+        <w:rPr>
+          <w:rFonts w:eastAsia="Calibri" w:cs="Calibri" w:ascii="Calibri" w:hAnsi="Calibri"/>
+          <w:color w:val="444444"/>
+          <w:sz w:val="20"/>
+          <w:szCs w:val="20"/>
+        </w:rPr>
+        <w:t xml:space="preserve">. Currently completing an </w:t>
       </w:r>
       <w:r>
         <w:rPr>
@@ -265,25 +283,6 @@
           <w:sz w:val="20"/>
           <w:szCs w:val="20"/>
         </w:rPr>
-        <w:t>Python, FastAPI, PostgreSQL (pgvector), LangChain, and cloud-ready AI systems</w:t>
-      </w:r>
-      <w:r>
-        <w:rPr>
-          <w:rFonts w:eastAsia="Calibri" w:cs="Calibri" w:ascii="Calibri" w:hAnsi="Calibri"/>
-          <w:color w:val="444444"/>
-          <w:sz w:val="20"/>
-          <w:szCs w:val="20"/>
-        </w:rPr>
-        <w:t xml:space="preserve">. Currently completing an </w:t>
-      </w:r>
-      <w:r>
-        <w:rPr>
-          <w:rStyle w:val="Strong"/>
-          <w:rFonts w:eastAsia="Calibri" w:cs="Calibri" w:ascii="Calibri" w:hAnsi="Calibri"/>
-          <w:color w:val="444444"/>
-          <w:sz w:val="20"/>
-          <w:szCs w:val="20"/>
-        </w:rPr>
         <w:t>MBA in Artificial Intelligence &amp; Machine Learning</w:t>
       </w:r>
       <w:r>
@@ -293,16 +292,7 @@
           <w:sz w:val="20"/>
           <w:szCs w:val="20"/>
         </w:rPr>
-        <w:t>, combining strong technical expertise with business strategy.</w:t>
-      </w:r>
-      <w:r>
-        <w:rPr>
-          <w:rFonts w:eastAsia="Calibri" w:cs="Calibri" w:ascii="Calibri" w:hAnsi="Calibri"/>
-          <w:color w:val="444444"/>
-          <w:sz w:val="20"/>
-          <w:szCs w:val="20"/>
-        </w:rPr>
-        <w:t>]</w:t>
+        <w:t>, combining strong technical expertise with business strategy.]</w:t>
       </w:r>
     </w:p>
     <w:p>
@@ -1895,8 +1885,8 @@
       <w:u w:val="single"/>
     </w:rPr>
   </w:style>
-  <w:style w:type="character" w:styleId="FootnoteCharacters">
-    <w:name w:val="Footnote Characters"/>
+  <w:style w:type="character" w:styleId="FootnoteCharactersuser">
+    <w:name w:val="Footnote Characters (user)"/>
     <w:uiPriority w:val="99"/>
     <w:semiHidden/>
     <w:unhideWhenUsed/>
@@ -1905,8 +1895,8 @@
       <w:vertAlign w:val="superscript"/>
     </w:rPr>
   </w:style>
-  <w:style w:type="character" w:styleId="FootnoteCharactersuser">
-    <w:name w:val="Footnote Characters (user)"/>
+  <w:style w:type="character" w:styleId="FootnoteCharacters">
+    <w:name w:val="Footnote Characters"/>
     <w:qFormat/>
     <w:rPr>
       <w:vertAlign w:val="superscript"/>
@@ -1930,8 +1920,8 @@
       <w:szCs w:val="20"/>
     </w:rPr>
   </w:style>
-  <w:style w:type="character" w:styleId="EndnoteCharacters">
-    <w:name w:val="Endnote Characters"/>
+  <w:style w:type="character" w:styleId="EndnoteCharactersuser">
+    <w:name w:val="Endnote Characters (user)"/>
     <w:uiPriority w:val="99"/>
     <w:semiHidden/>
     <w:unhideWhenUsed/>
@@ -1940,8 +1930,8 @@
       <w:vertAlign w:val="superscript"/>
     </w:rPr>
   </w:style>
-  <w:style w:type="character" w:styleId="EndnoteCharactersuser">
-    <w:name w:val="Endnote Characters (user)"/>
+  <w:style w:type="character" w:styleId="EndnoteCharacters">
+    <w:name w:val="Endnote Characters"/>
     <w:qFormat/>
     <w:rPr>
       <w:vertAlign w:val="superscript"/>
@@ -1980,8 +1970,8 @@
       <w:u w:val="single"/>
     </w:rPr>
   </w:style>
-  <w:style w:type="character" w:styleId="Bullets">
-    <w:name w:val="Bullets"/>
+  <w:style w:type="character" w:styleId="Bulletsuser">
+    <w:name w:val="Bullets (user)"/>
     <w:qFormat/>
     <w:rPr>
       <w:rFonts w:ascii="OpenSymbol" w:hAnsi="OpenSymbol" w:eastAsia="OpenSymbol" w:cs="OpenSymbol"/>

</xml_diff>